<commit_message>
Test developer for reservation lookup
</commit_message>
<xml_diff>
--- a/tests/GoldTeam_TestPlan_Reservation_LookUp.docx
+++ b/tests/GoldTeam_TestPlan_Reservation_LookUp.docx
@@ -292,31 +292,11 @@
             <w:r>
               <w:rPr>
                 <w:rFonts w:ascii="Arial" w:hAnsi="Arial" w:cs="Arial"/>
-                <w:color w:val="C00000"/>
-                <w:sz w:val="20"/>
-                <w:szCs w:val="20"/>
-              </w:rPr>
-              <w:t>&lt;Enter a date (</w:t>
-            </w:r>
-            <w:proofErr w:type="spellStart"/>
-            <w:r>
-              <w:rPr>
-                <w:rFonts w:ascii="Arial" w:hAnsi="Arial" w:cs="Arial"/>
-                <w:color w:val="C00000"/>
-                <w:sz w:val="20"/>
-                <w:szCs w:val="20"/>
-              </w:rPr>
-              <w:t>yyyy</w:t>
-            </w:r>
-            <w:proofErr w:type="spellEnd"/>
-            <w:r>
-              <w:rPr>
-                <w:rFonts w:ascii="Arial" w:hAnsi="Arial" w:cs="Arial"/>
-                <w:color w:val="C00000"/>
-                <w:sz w:val="20"/>
-                <w:szCs w:val="20"/>
-              </w:rPr>
-              <w:t>/mm/dd)&gt;</w:t>
+                <w:color w:val="EE0000"/>
+                <w:sz w:val="20"/>
+                <w:szCs w:val="20"/>
+              </w:rPr>
+              <w:t>2026/09/18</w:t>
             </w:r>
           </w:p>
         </w:tc>
@@ -480,6 +460,12 @@
                 <w:noProof/>
                 <w:webHidden/>
               </w:rPr>
+            </w:r>
+            <w:r>
+              <w:rPr>
+                <w:noProof/>
+                <w:webHidden/>
+              </w:rPr>
               <w:fldChar w:fldCharType="separate"/>
             </w:r>
             <w:r>
@@ -548,6 +534,12 @@
                 <w:noProof/>
                 <w:webHidden/>
               </w:rPr>
+            </w:r>
+            <w:r>
+              <w:rPr>
+                <w:noProof/>
+                <w:webHidden/>
+              </w:rPr>
               <w:fldChar w:fldCharType="separate"/>
             </w:r>
             <w:r>
@@ -610,6 +602,12 @@
                 <w:webHidden/>
               </w:rPr>
               <w:instrText xml:space="preserve"> PAGEREF _Toc132718197 \h </w:instrText>
+            </w:r>
+            <w:r>
+              <w:rPr>
+                <w:noProof/>
+                <w:webHidden/>
+              </w:rPr>
             </w:r>
             <w:r>
               <w:rPr>
@@ -1124,13 +1122,20 @@
             <w:r>
               <w:rPr>
                 <w:rFonts w:ascii="Arial" w:hAnsi="Arial" w:cs="Arial"/>
-                <w:b/>
-                <w:bCs/>
                 <w:color w:val="2F5496" w:themeColor="accent1" w:themeShade="BF"/>
                 <w:sz w:val="20"/>
                 <w:szCs w:val="20"/>
               </w:rPr>
-              <w:t>name</w:t>
+              <w:t>Patrice</w:t>
+            </w:r>
+            <w:r>
+              <w:rPr>
+                <w:rFonts w:ascii="Arial" w:hAnsi="Arial" w:cs="Arial"/>
+                <w:color w:val="2F5496" w:themeColor="accent1" w:themeShade="BF"/>
+                <w:sz w:val="20"/>
+                <w:szCs w:val="20"/>
+              </w:rPr>
+              <w:t xml:space="preserve"> Moracchini</w:t>
             </w:r>
           </w:p>
           <w:p>
@@ -1166,9 +1171,8 @@
                 <w:sz w:val="20"/>
                 <w:szCs w:val="20"/>
               </w:rPr>
-              <w:t>&lt;</w:t>
-            </w:r>
-            <w:proofErr w:type="spellStart"/>
+              <w:t>2026</w:t>
+            </w:r>
             <w:r>
               <w:rPr>
                 <w:rFonts w:ascii="Arial" w:hAnsi="Arial" w:cs="Arial"/>
@@ -1176,9 +1180,8 @@
                 <w:sz w:val="20"/>
                 <w:szCs w:val="20"/>
               </w:rPr>
-              <w:t>yyyy</w:t>
-            </w:r>
-            <w:proofErr w:type="spellEnd"/>
+              <w:t>/</w:t>
+            </w:r>
             <w:r>
               <w:rPr>
                 <w:rFonts w:ascii="Arial" w:hAnsi="Arial" w:cs="Arial"/>
@@ -1186,7 +1189,34 @@
                 <w:sz w:val="20"/>
                 <w:szCs w:val="20"/>
               </w:rPr>
-              <w:t xml:space="preserve">/mm/dd&gt; </w:t>
+              <w:t>09</w:t>
+            </w:r>
+            <w:r>
+              <w:rPr>
+                <w:rFonts w:ascii="Arial" w:hAnsi="Arial" w:cs="Arial"/>
+                <w:color w:val="2F5496" w:themeColor="accent1" w:themeShade="BF"/>
+                <w:sz w:val="20"/>
+                <w:szCs w:val="20"/>
+              </w:rPr>
+              <w:t>/</w:t>
+            </w:r>
+            <w:r>
+              <w:rPr>
+                <w:rFonts w:ascii="Arial" w:hAnsi="Arial" w:cs="Arial"/>
+                <w:color w:val="2F5496" w:themeColor="accent1" w:themeShade="BF"/>
+                <w:sz w:val="20"/>
+                <w:szCs w:val="20"/>
+              </w:rPr>
+              <w:t>18</w:t>
+            </w:r>
+            <w:r>
+              <w:rPr>
+                <w:rFonts w:ascii="Arial" w:hAnsi="Arial" w:cs="Arial"/>
+                <w:color w:val="2F5496" w:themeColor="accent1" w:themeShade="BF"/>
+                <w:sz w:val="20"/>
+                <w:szCs w:val="20"/>
+              </w:rPr>
+              <w:t xml:space="preserve"> </w:t>
             </w:r>
           </w:p>
         </w:tc>
@@ -1566,7 +1596,7 @@
                 <w:sz w:val="20"/>
                 <w:szCs w:val="20"/>
               </w:rPr>
-              <w:t>&lt;yes/no&gt;</w:t>
+              <w:t>yes</w:t>
             </w:r>
           </w:p>
         </w:tc>
@@ -1694,7 +1724,7 @@
                 <w:sz w:val="20"/>
                 <w:szCs w:val="20"/>
               </w:rPr>
-              <w:t>&lt;yes/no&gt;</w:t>
+              <w:t>yes</w:t>
             </w:r>
           </w:p>
         </w:tc>
@@ -1822,7 +1852,7 @@
                 <w:sz w:val="20"/>
                 <w:szCs w:val="20"/>
               </w:rPr>
-              <w:t>&lt;yes/no&gt;</w:t>
+              <w:t>yes</w:t>
             </w:r>
           </w:p>
         </w:tc>
@@ -1950,7 +1980,7 @@
                 <w:sz w:val="20"/>
                 <w:szCs w:val="20"/>
               </w:rPr>
-              <w:t>&lt;yes/no&gt;</w:t>
+              <w:t>yes</w:t>
             </w:r>
           </w:p>
         </w:tc>
@@ -2073,7 +2103,7 @@
                 <w:sz w:val="20"/>
                 <w:szCs w:val="20"/>
               </w:rPr>
-              <w:t>All the reservations associated with this email are displayed bellow the search forms.</w:t>
+              <w:t>All the reservations associated with this email are displayed below the search forms.</w:t>
             </w:r>
           </w:p>
         </w:tc>
@@ -2098,7 +2128,7 @@
                 <w:sz w:val="20"/>
                 <w:szCs w:val="20"/>
               </w:rPr>
-              <w:t>&lt;yes/no&gt;</w:t>
+              <w:t>yes</w:t>
             </w:r>
           </w:p>
         </w:tc>
@@ -2235,7 +2265,7 @@
                 <w:sz w:val="20"/>
                 <w:szCs w:val="20"/>
               </w:rPr>
-              <w:t>&lt;yes/no&gt;</w:t>
+              <w:t>yes</w:t>
             </w:r>
           </w:p>
         </w:tc>
@@ -2313,16 +2343,7 @@
                 <w:sz w:val="20"/>
                 <w:szCs w:val="20"/>
               </w:rPr>
-              <w:t xml:space="preserve">On the same page, </w:t>
-            </w:r>
-            <w:r>
-              <w:rPr>
-                <w:rFonts w:ascii="Arial" w:hAnsi="Arial" w:cs="Arial"/>
-                <w:color w:val="C00000"/>
-                <w:sz w:val="20"/>
-                <w:szCs w:val="20"/>
-              </w:rPr>
-              <w:t>enter a</w:t>
+              <w:t>On the same page, enter a</w:t>
             </w:r>
             <w:r>
               <w:rPr>
@@ -2401,7 +2422,7 @@
                 <w:sz w:val="20"/>
                 <w:szCs w:val="20"/>
               </w:rPr>
-              <w:t>, and no reservation details appears bellow the search forms.</w:t>
+              <w:t>, and no reservation details appears below the search forms.</w:t>
             </w:r>
           </w:p>
         </w:tc>
@@ -2426,7 +2447,7 @@
                 <w:sz w:val="20"/>
                 <w:szCs w:val="20"/>
               </w:rPr>
-              <w:t>&lt;yes/no&gt;</w:t>
+              <w:t>yes</w:t>
             </w:r>
           </w:p>
         </w:tc>
@@ -2719,6 +2740,34 @@
               </w:rPr>
               <w:t>Developer:</w:t>
             </w:r>
+            <w:r>
+              <w:rPr>
+                <w:rFonts w:ascii="Arial" w:hAnsi="Arial" w:cs="Arial"/>
+                <w:b/>
+                <w:bCs/>
+                <w:sz w:val="20"/>
+                <w:szCs w:val="20"/>
+              </w:rPr>
+              <w:t xml:space="preserve"> </w:t>
+            </w:r>
+            <w:r>
+              <w:rPr>
+                <w:rFonts w:ascii="Arial" w:hAnsi="Arial" w:cs="Arial"/>
+                <w:color w:val="2F5496" w:themeColor="accent1" w:themeShade="BF"/>
+                <w:sz w:val="20"/>
+                <w:szCs w:val="20"/>
+              </w:rPr>
+              <w:t>Patrice</w:t>
+            </w:r>
+            <w:r>
+              <w:rPr>
+                <w:rFonts w:ascii="Arial" w:hAnsi="Arial" w:cs="Arial"/>
+                <w:color w:val="2F5496" w:themeColor="accent1" w:themeShade="BF"/>
+                <w:sz w:val="20"/>
+                <w:szCs w:val="20"/>
+              </w:rPr>
+              <w:t xml:space="preserve"> Moracchini</w:t>
+            </w:r>
           </w:p>
           <w:p>
             <w:pPr>
@@ -2753,9 +2802,8 @@
                 <w:sz w:val="20"/>
                 <w:szCs w:val="20"/>
               </w:rPr>
-              <w:t>&lt;</w:t>
-            </w:r>
-            <w:proofErr w:type="spellStart"/>
+              <w:t>2026</w:t>
+            </w:r>
             <w:r>
               <w:rPr>
                 <w:rFonts w:ascii="Arial" w:hAnsi="Arial" w:cs="Arial"/>
@@ -2763,9 +2811,8 @@
                 <w:sz w:val="20"/>
                 <w:szCs w:val="20"/>
               </w:rPr>
-              <w:t>yyyy</w:t>
-            </w:r>
-            <w:proofErr w:type="spellEnd"/>
+              <w:t>/</w:t>
+            </w:r>
             <w:r>
               <w:rPr>
                 <w:rFonts w:ascii="Arial" w:hAnsi="Arial" w:cs="Arial"/>
@@ -2773,7 +2820,25 @@
                 <w:sz w:val="20"/>
                 <w:szCs w:val="20"/>
               </w:rPr>
-              <w:t>/mm/dd&gt;</w:t>
+              <w:t>09</w:t>
+            </w:r>
+            <w:r>
+              <w:rPr>
+                <w:rFonts w:ascii="Arial" w:hAnsi="Arial" w:cs="Arial"/>
+                <w:color w:val="2F5496" w:themeColor="accent1" w:themeShade="BF"/>
+                <w:sz w:val="20"/>
+                <w:szCs w:val="20"/>
+              </w:rPr>
+              <w:t>/</w:t>
+            </w:r>
+            <w:r>
+              <w:rPr>
+                <w:rFonts w:ascii="Arial" w:hAnsi="Arial" w:cs="Arial"/>
+                <w:color w:val="2F5496" w:themeColor="accent1" w:themeShade="BF"/>
+                <w:sz w:val="20"/>
+                <w:szCs w:val="20"/>
+              </w:rPr>
+              <w:t>18</w:t>
             </w:r>
           </w:p>
         </w:tc>
@@ -3099,7 +3164,7 @@
                 <w:sz w:val="20"/>
                 <w:szCs w:val="20"/>
               </w:rPr>
-              <w:t>&lt;yes/no&gt;</w:t>
+              <w:t>yes</w:t>
             </w:r>
           </w:p>
         </w:tc>
@@ -3202,7 +3267,7 @@
                 <w:sz w:val="20"/>
                 <w:szCs w:val="20"/>
               </w:rPr>
-              <w:t>The associated reservation displays bellow the search forms.</w:t>
+              <w:t>The associated reservation displays below the search forms.</w:t>
             </w:r>
           </w:p>
         </w:tc>
@@ -3227,7 +3292,7 @@
                 <w:sz w:val="20"/>
                 <w:szCs w:val="20"/>
               </w:rPr>
-              <w:t>&lt;yes/no&gt;</w:t>
+              <w:t>yes</w:t>
             </w:r>
           </w:p>
         </w:tc>
@@ -3314,25 +3379,7 @@
                 <w:sz w:val="20"/>
                 <w:szCs w:val="20"/>
               </w:rPr>
-              <w:t xml:space="preserve"> </w:t>
-            </w:r>
-            <w:r>
-              <w:rPr>
-                <w:rFonts w:ascii="Arial" w:hAnsi="Arial" w:cs="Arial"/>
-                <w:color w:val="C00000"/>
-                <w:sz w:val="20"/>
-                <w:szCs w:val="20"/>
-              </w:rPr>
-              <w:t xml:space="preserve">MBR number </w:t>
-            </w:r>
-            <w:r>
-              <w:rPr>
-                <w:rFonts w:ascii="Arial" w:hAnsi="Arial" w:cs="Arial"/>
-                <w:color w:val="C00000"/>
-                <w:sz w:val="20"/>
-                <w:szCs w:val="20"/>
-              </w:rPr>
-              <w:t>2 last</w:t>
+              <w:t xml:space="preserve"> MBR number 2 last</w:t>
             </w:r>
             <w:r>
               <w:rPr>
@@ -3384,7 +3431,7 @@
                 <w:sz w:val="20"/>
                 <w:szCs w:val="20"/>
               </w:rPr>
-              <w:t>, and no reservation details appears bellow the search forms.</w:t>
+              <w:t>, and no reservation details appears below the search forms.</w:t>
             </w:r>
           </w:p>
         </w:tc>
@@ -3409,135 +3456,7 @@
                 <w:sz w:val="20"/>
                 <w:szCs w:val="20"/>
               </w:rPr>
-              <w:t>&lt;yes/no&gt;</w:t>
-            </w:r>
-          </w:p>
-        </w:tc>
-        <w:tc>
-          <w:tcPr>
-            <w:tcW w:w="2052" w:type="dxa"/>
-          </w:tcPr>
-          <w:p>
-            <w:pPr>
-              <w:spacing w:before="80" w:after="80"/>
-              <w:rPr>
-                <w:rFonts w:ascii="Arial" w:hAnsi="Arial" w:cs="Arial"/>
-                <w:color w:val="C00000"/>
-                <w:sz w:val="20"/>
-                <w:szCs w:val="20"/>
-              </w:rPr>
-            </w:pPr>
-            <w:r>
-              <w:rPr>
-                <w:rFonts w:ascii="Arial" w:hAnsi="Arial" w:cs="Arial"/>
-                <w:color w:val="538135" w:themeColor="accent6" w:themeShade="BF"/>
-                <w:sz w:val="20"/>
-                <w:szCs w:val="20"/>
-              </w:rPr>
-              <w:t>&lt;yes/no&gt;</w:t>
-            </w:r>
-          </w:p>
-        </w:tc>
-      </w:tr>
-      <w:tr>
-        <w:trPr>
-          <w:trHeight w:val="350"/>
-        </w:trPr>
-        <w:tc>
-          <w:tcPr>
-            <w:tcW w:w="1250" w:type="dxa"/>
-          </w:tcPr>
-          <w:p>
-            <w:pPr>
-              <w:spacing w:before="80" w:after="80"/>
-              <w:rPr>
-                <w:rFonts w:ascii="Arial" w:hAnsi="Arial" w:cs="Arial"/>
-                <w:sz w:val="20"/>
-                <w:szCs w:val="20"/>
-              </w:rPr>
-            </w:pPr>
-            <w:r>
-              <w:rPr>
-                <w:rFonts w:ascii="Arial" w:hAnsi="Arial" w:cs="Arial"/>
-                <w:sz w:val="20"/>
-                <w:szCs w:val="20"/>
-              </w:rPr>
-              <w:t>4</w:t>
-            </w:r>
-          </w:p>
-        </w:tc>
-        <w:tc>
-          <w:tcPr>
-            <w:tcW w:w="3570" w:type="dxa"/>
-          </w:tcPr>
-          <w:p>
-            <w:pPr>
-              <w:spacing w:before="80" w:after="80"/>
-              <w:rPr>
-                <w:rFonts w:ascii="Arial" w:hAnsi="Arial" w:cs="Arial"/>
-                <w:color w:val="C00000"/>
-                <w:sz w:val="20"/>
-                <w:szCs w:val="20"/>
-              </w:rPr>
-            </w:pPr>
-            <w:r>
-              <w:rPr>
-                <w:rFonts w:ascii="Arial" w:hAnsi="Arial" w:cs="Arial"/>
-                <w:color w:val="C00000"/>
-                <w:sz w:val="20"/>
-                <w:szCs w:val="20"/>
-              </w:rPr>
-              <w:t>&lt;Enter an action&gt;</w:t>
-            </w:r>
-          </w:p>
-        </w:tc>
-        <w:tc>
-          <w:tcPr>
-            <w:tcW w:w="3930" w:type="dxa"/>
-          </w:tcPr>
-          <w:p>
-            <w:pPr>
-              <w:spacing w:before="80" w:after="80"/>
-              <w:rPr>
-                <w:rFonts w:ascii="Arial" w:hAnsi="Arial" w:cs="Arial"/>
-                <w:color w:val="C00000"/>
-                <w:sz w:val="20"/>
-                <w:szCs w:val="20"/>
-              </w:rPr>
-            </w:pPr>
-            <w:r>
-              <w:rPr>
-                <w:rFonts w:ascii="Arial" w:hAnsi="Arial" w:cs="Arial"/>
-                <w:color w:val="C00000"/>
-                <w:sz w:val="20"/>
-                <w:szCs w:val="20"/>
-              </w:rPr>
-              <w:t>&lt;Enter the expected results&gt;</w:t>
-            </w:r>
-          </w:p>
-        </w:tc>
-        <w:tc>
-          <w:tcPr>
-            <w:tcW w:w="2148" w:type="dxa"/>
-          </w:tcPr>
-          <w:p>
-            <w:pPr>
-              <w:spacing w:before="80" w:after="80"/>
-              <w:rPr>
-                <w:rFonts w:ascii="Arial" w:hAnsi="Arial" w:cs="Arial"/>
-                <w:color w:val="C00000"/>
-                <w:sz w:val="20"/>
-                <w:szCs w:val="20"/>
-              </w:rPr>
-            </w:pPr>
-            <w:r>
-              <w:rPr>
-                <w:rFonts w:ascii="Arial" w:hAnsi="Arial" w:cs="Arial"/>
-                <w:color w:val="2F5496" w:themeColor="accent1" w:themeShade="BF"/>
-                <w:sz w:val="20"/>
-                <w:szCs w:val="20"/>
-              </w:rPr>
-              <w:t>&lt;yes/no&gt;</w:t>
+              <w:t>yes</w:t>
             </w:r>
           </w:p>
         </w:tc>
@@ -4389,6 +4308,7 @@
   <w:style w:type="character" w:default="1" w:styleId="DefaultParagraphFont">
     <w:name w:val="Default Paragraph Font"/>
     <w:uiPriority w:val="1"/>
+    <w:semiHidden/>
     <w:unhideWhenUsed/>
   </w:style>
   <w:style w:type="table" w:default="1" w:styleId="TableNormal">

</xml_diff>

<commit_message>
Peer test section complete
</commit_message>
<xml_diff>
--- a/tests/GoldTeam_TestPlan_Reservation_LookUp.docx
+++ b/tests/GoldTeam_TestPlan_Reservation_LookUp.docx
@@ -403,6 +403,10 @@
             <w:rPr>
               <w:rFonts w:eastAsiaTheme="minorEastAsia"/>
               <w:noProof/>
+              <w:kern w:val="2"/>
+              <w:sz w:val="24"/>
+              <w:szCs w:val="24"/>
+              <w14:ligatures w14:val="standardContextual"/>
             </w:rPr>
           </w:pPr>
           <w:r>
@@ -423,7 +427,7 @@
             </w:rPr>
             <w:fldChar w:fldCharType="separate"/>
           </w:r>
-          <w:hyperlink w:anchor="_Toc132718195" w:history="1">
+          <w:hyperlink w:anchor="_Toc240801312" w:history="1">
             <w:r>
               <w:rPr>
                 <w:rStyle w:val="Hyperlink"/>
@@ -432,7 +436,7 @@
                 <w:bCs/>
                 <w:noProof/>
               </w:rPr>
-              <w:t>&lt;DESCRIPTION&gt;</w:t>
+              <w:t>Entering an Email Address Displays an Associated Reservation</w:t>
             </w:r>
             <w:r>
               <w:rPr>
@@ -453,7 +457,7 @@
                 <w:noProof/>
                 <w:webHidden/>
               </w:rPr>
-              <w:instrText xml:space="preserve"> PAGEREF _Toc132718195 \h </w:instrText>
+              <w:instrText xml:space="preserve"> PAGEREF _Toc240801312 \h </w:instrText>
             </w:r>
             <w:r>
               <w:rPr>
@@ -470,12 +474,10 @@
             </w:r>
             <w:r>
               <w:rPr>
-                <w:b/>
-                <w:bCs/>
                 <w:noProof/>
                 <w:webHidden/>
               </w:rPr>
-              <w:t>Error! Bookmark not defined.</w:t>
+              <w:t>3</w:t>
             </w:r>
             <w:r>
               <w:rPr>
@@ -495,9 +497,13 @@
             <w:rPr>
               <w:rFonts w:eastAsiaTheme="minorEastAsia"/>
               <w:noProof/>
+              <w:kern w:val="2"/>
+              <w:sz w:val="24"/>
+              <w:szCs w:val="24"/>
+              <w14:ligatures w14:val="standardContextual"/>
             </w:rPr>
           </w:pPr>
-          <w:hyperlink w:anchor="_Toc132718196" w:history="1">
+          <w:hyperlink w:anchor="_Toc240801313" w:history="1">
             <w:r>
               <w:rPr>
                 <w:rStyle w:val="Hyperlink"/>
@@ -506,7 +512,7 @@
                 <w:bCs/>
                 <w:noProof/>
               </w:rPr>
-              <w:t>&lt;DESCRIPTION&gt;</w:t>
+              <w:t>Entering an MBR Number Displays an Associated Reservation</w:t>
             </w:r>
             <w:r>
               <w:rPr>
@@ -527,7 +533,7 @@
                 <w:noProof/>
                 <w:webHidden/>
               </w:rPr>
-              <w:instrText xml:space="preserve"> PAGEREF _Toc132718196 \h </w:instrText>
+              <w:instrText xml:space="preserve"> PAGEREF _Toc240801313 \h </w:instrText>
             </w:r>
             <w:r>
               <w:rPr>
@@ -544,86 +550,10 @@
             </w:r>
             <w:r>
               <w:rPr>
-                <w:b/>
-                <w:bCs/>
                 <w:noProof/>
                 <w:webHidden/>
               </w:rPr>
-              <w:t>Error! Bookmark not defined.</w:t>
-            </w:r>
-            <w:r>
-              <w:rPr>
-                <w:noProof/>
-                <w:webHidden/>
-              </w:rPr>
-              <w:fldChar w:fldCharType="end"/>
-            </w:r>
-          </w:hyperlink>
-        </w:p>
-        <w:p>
-          <w:pPr>
-            <w:pStyle w:val="TOC1"/>
-            <w:tabs>
-              <w:tab w:val="right" w:leader="dot" w:pos="12950"/>
-            </w:tabs>
-            <w:rPr>
-              <w:rFonts w:eastAsiaTheme="minorEastAsia"/>
-              <w:noProof/>
-            </w:rPr>
-          </w:pPr>
-          <w:hyperlink w:anchor="_Toc132718197" w:history="1">
-            <w:r>
-              <w:rPr>
-                <w:rStyle w:val="Hyperlink"/>
-                <w:rFonts w:ascii="Arial" w:hAnsi="Arial" w:cs="Arial"/>
-                <w:b/>
-                <w:bCs/>
-                <w:noProof/>
-              </w:rPr>
-              <w:t>&lt;DESCRIPTION&gt;</w:t>
-            </w:r>
-            <w:r>
-              <w:rPr>
-                <w:noProof/>
-                <w:webHidden/>
-              </w:rPr>
-              <w:tab/>
-            </w:r>
-            <w:r>
-              <w:rPr>
-                <w:noProof/>
-                <w:webHidden/>
-              </w:rPr>
-              <w:fldChar w:fldCharType="begin"/>
-            </w:r>
-            <w:r>
-              <w:rPr>
-                <w:noProof/>
-                <w:webHidden/>
-              </w:rPr>
-              <w:instrText xml:space="preserve"> PAGEREF _Toc132718197 \h </w:instrText>
-            </w:r>
-            <w:r>
-              <w:rPr>
-                <w:noProof/>
-                <w:webHidden/>
-              </w:rPr>
-            </w:r>
-            <w:r>
-              <w:rPr>
-                <w:noProof/>
-                <w:webHidden/>
-              </w:rPr>
-              <w:fldChar w:fldCharType="separate"/>
-            </w:r>
-            <w:r>
-              <w:rPr>
-                <w:b/>
-                <w:bCs/>
-                <w:noProof/>
-                <w:webHidden/>
-              </w:rPr>
-              <w:t>Error! Bookmark not defined.</w:t>
+              <w:t>6</w:t>
             </w:r>
             <w:r>
               <w:rPr>
@@ -824,6 +754,26 @@
           <w:szCs w:val="24"/>
         </w:rPr>
       </w:pPr>
+    </w:p>
+    <w:p>
+      <w:pPr>
+        <w:pStyle w:val="NoSpacing"/>
+        <w:rPr>
+          <w:rFonts w:ascii="Arial" w:hAnsi="Arial" w:cs="Arial"/>
+          <w:sz w:val="24"/>
+          <w:szCs w:val="24"/>
+        </w:rPr>
+      </w:pPr>
+    </w:p>
+    <w:p>
+      <w:pPr>
+        <w:pStyle w:val="NoSpacing"/>
+        <w:rPr>
+          <w:rFonts w:ascii="Arial" w:hAnsi="Arial" w:cs="Arial"/>
+          <w:sz w:val="24"/>
+          <w:szCs w:val="24"/>
+        </w:rPr>
+      </w:pPr>
       <w:r>
         <w:rPr>
           <w:rFonts w:ascii="Arial" w:hAnsi="Arial" w:cs="Arial"/>
@@ -952,11 +902,11 @@
         <w:tblLook w:val="04A0" w:firstRow="1" w:lastRow="0" w:firstColumn="1" w:lastColumn="0" w:noHBand="0" w:noVBand="1"/>
       </w:tblPr>
       <w:tblGrid>
-        <w:gridCol w:w="1250"/>
-        <w:gridCol w:w="3571"/>
-        <w:gridCol w:w="3929"/>
-        <w:gridCol w:w="2148"/>
-        <w:gridCol w:w="2052"/>
+        <w:gridCol w:w="1251"/>
+        <w:gridCol w:w="3146"/>
+        <w:gridCol w:w="2920"/>
+        <w:gridCol w:w="1777"/>
+        <w:gridCol w:w="3856"/>
       </w:tblGrid>
       <w:tr>
         <w:trPr>
@@ -1001,6 +951,7 @@
                 <w:bCs/>
               </w:rPr>
             </w:pPr>
+            <w:bookmarkStart w:id="0" w:name="_Toc240801312"/>
             <w:r>
               <w:rPr>
                 <w:rFonts w:ascii="Arial" w:hAnsi="Arial" w:cs="Arial"/>
@@ -1009,6 +960,7 @@
               </w:rPr>
               <w:t>Entering an Email Address Displays an Associated Reservation</w:t>
             </w:r>
+            <w:bookmarkEnd w:id="0"/>
           </w:p>
         </w:tc>
       </w:tr>
@@ -1255,7 +1207,7 @@
                 <w:sz w:val="20"/>
                 <w:szCs w:val="20"/>
               </w:rPr>
-              <w:t>name</w:t>
+              <w:t>Jose</w:t>
             </w:r>
           </w:p>
           <w:p>
@@ -1291,27 +1243,7 @@
                 <w:sz w:val="20"/>
                 <w:szCs w:val="20"/>
               </w:rPr>
-              <w:t>&lt;</w:t>
-            </w:r>
-            <w:proofErr w:type="spellStart"/>
-            <w:r>
-              <w:rPr>
-                <w:rFonts w:ascii="Arial" w:hAnsi="Arial" w:cs="Arial"/>
-                <w:color w:val="538135" w:themeColor="accent6" w:themeShade="BF"/>
-                <w:sz w:val="20"/>
-                <w:szCs w:val="20"/>
-              </w:rPr>
-              <w:t>yyyy</w:t>
-            </w:r>
-            <w:proofErr w:type="spellEnd"/>
-            <w:r>
-              <w:rPr>
-                <w:rFonts w:ascii="Arial" w:hAnsi="Arial" w:cs="Arial"/>
-                <w:color w:val="538135" w:themeColor="accent6" w:themeShade="BF"/>
-                <w:sz w:val="20"/>
-                <w:szCs w:val="20"/>
-              </w:rPr>
-              <w:t>/mm/dd&gt;</w:t>
+              <w:t>2026/09/20</w:t>
             </w:r>
           </w:p>
         </w:tc>
@@ -1621,7 +1553,77 @@
                 <w:sz w:val="20"/>
                 <w:szCs w:val="20"/>
               </w:rPr>
-              <w:t>&lt;yes/no&gt;</w:t>
+              <w:t>ye</w:t>
+            </w:r>
+            <w:r>
+              <w:rPr>
+                <w:rFonts w:ascii="Arial" w:hAnsi="Arial" w:cs="Arial"/>
+                <w:color w:val="538135" w:themeColor="accent6" w:themeShade="BF"/>
+                <w:sz w:val="20"/>
+                <w:szCs w:val="20"/>
+              </w:rPr>
+              <w:t>s</w:t>
+            </w:r>
+          </w:p>
+          <w:p>
+            <w:pPr>
+              <w:spacing w:before="80" w:after="80"/>
+              <w:rPr>
+                <w:rFonts w:ascii="Arial" w:hAnsi="Arial" w:cs="Arial"/>
+                <w:color w:val="538135" w:themeColor="accent6" w:themeShade="BF"/>
+                <w:sz w:val="20"/>
+                <w:szCs w:val="20"/>
+              </w:rPr>
+            </w:pPr>
+            <w:r>
+              <w:rPr>
+                <w:rFonts w:ascii="Arial" w:hAnsi="Arial" w:cs="Arial"/>
+                <w:noProof/>
+                <w:color w:val="538135" w:themeColor="accent6" w:themeShade="BF"/>
+                <w:sz w:val="20"/>
+                <w:szCs w:val="20"/>
+              </w:rPr>
+              <w:drawing>
+                <wp:inline distT="0" distB="0" distL="0" distR="0" wp14:anchorId="5B50A338" wp14:editId="7FF6E91C">
+                  <wp:extent cx="2082297" cy="1465962"/>
+                  <wp:effectExtent l="0" t="0" r="635" b="0"/>
+                  <wp:docPr id="472746889" name="Picture 1"/>
+                  <wp:cNvGraphicFramePr>
+                    <a:graphicFrameLocks xmlns:a="http://schemas.openxmlformats.org/drawingml/2006/main" noChangeAspect="1"/>
+                  </wp:cNvGraphicFramePr>
+                  <a:graphic xmlns:a="http://schemas.openxmlformats.org/drawingml/2006/main">
+                    <a:graphicData uri="http://schemas.openxmlformats.org/drawingml/2006/picture">
+                      <pic:pic xmlns:pic="http://schemas.openxmlformats.org/drawingml/2006/picture">
+                        <pic:nvPicPr>
+                          <pic:cNvPr id="472746889" name="Picture 472746889"/>
+                          <pic:cNvPicPr/>
+                        </pic:nvPicPr>
+                        <pic:blipFill>
+                          <a:blip r:embed="rId7" cstate="print">
+                            <a:extLst>
+                              <a:ext uri="{28A0092B-C50C-407E-A947-70E740481C1C}">
+                                <a14:useLocalDpi xmlns:a14="http://schemas.microsoft.com/office/drawing/2010/main" val="0"/>
+                              </a:ext>
+                            </a:extLst>
+                          </a:blip>
+                          <a:stretch>
+                            <a:fillRect/>
+                          </a:stretch>
+                        </pic:blipFill>
+                        <pic:spPr>
+                          <a:xfrm>
+                            <a:off x="0" y="0"/>
+                            <a:ext cx="2168469" cy="1526628"/>
+                          </a:xfrm>
+                          <a:prstGeom prst="rect">
+                            <a:avLst/>
+                          </a:prstGeom>
+                        </pic:spPr>
+                      </pic:pic>
+                    </a:graphicData>
+                  </a:graphic>
+                </wp:inline>
+              </w:drawing>
             </w:r>
           </w:p>
         </w:tc>
@@ -1749,7 +1751,77 @@
                 <w:sz w:val="20"/>
                 <w:szCs w:val="20"/>
               </w:rPr>
-              <w:t>&lt;yes/no&gt;</w:t>
+              <w:t>ye</w:t>
+            </w:r>
+            <w:r>
+              <w:rPr>
+                <w:rFonts w:ascii="Arial" w:hAnsi="Arial" w:cs="Arial"/>
+                <w:color w:val="538135" w:themeColor="accent6" w:themeShade="BF"/>
+                <w:sz w:val="20"/>
+                <w:szCs w:val="20"/>
+              </w:rPr>
+              <w:t>s</w:t>
+            </w:r>
+          </w:p>
+          <w:p>
+            <w:pPr>
+              <w:spacing w:before="80" w:after="80"/>
+              <w:rPr>
+                <w:rFonts w:ascii="Arial" w:hAnsi="Arial" w:cs="Arial"/>
+                <w:color w:val="538135" w:themeColor="accent6" w:themeShade="BF"/>
+                <w:sz w:val="20"/>
+                <w:szCs w:val="20"/>
+              </w:rPr>
+            </w:pPr>
+            <w:r>
+              <w:rPr>
+                <w:rFonts w:ascii="Arial" w:hAnsi="Arial" w:cs="Arial"/>
+                <w:noProof/>
+                <w:color w:val="538135" w:themeColor="accent6" w:themeShade="BF"/>
+                <w:sz w:val="20"/>
+                <w:szCs w:val="20"/>
+              </w:rPr>
+              <w:drawing>
+                <wp:inline distT="0" distB="0" distL="0" distR="0" wp14:anchorId="71ACA764" wp14:editId="2CF57514">
+                  <wp:extent cx="2199992" cy="1079966"/>
+                  <wp:effectExtent l="0" t="0" r="0" b="0"/>
+                  <wp:docPr id="792403022" name="Picture 2"/>
+                  <wp:cNvGraphicFramePr>
+                    <a:graphicFrameLocks xmlns:a="http://schemas.openxmlformats.org/drawingml/2006/main" noChangeAspect="1"/>
+                  </wp:cNvGraphicFramePr>
+                  <a:graphic xmlns:a="http://schemas.openxmlformats.org/drawingml/2006/main">
+                    <a:graphicData uri="http://schemas.openxmlformats.org/drawingml/2006/picture">
+                      <pic:pic xmlns:pic="http://schemas.openxmlformats.org/drawingml/2006/picture">
+                        <pic:nvPicPr>
+                          <pic:cNvPr id="792403022" name="Picture 792403022"/>
+                          <pic:cNvPicPr/>
+                        </pic:nvPicPr>
+                        <pic:blipFill>
+                          <a:blip r:embed="rId8" cstate="print">
+                            <a:extLst>
+                              <a:ext uri="{28A0092B-C50C-407E-A947-70E740481C1C}">
+                                <a14:useLocalDpi xmlns:a14="http://schemas.microsoft.com/office/drawing/2010/main" val="0"/>
+                              </a:ext>
+                            </a:extLst>
+                          </a:blip>
+                          <a:stretch>
+                            <a:fillRect/>
+                          </a:stretch>
+                        </pic:blipFill>
+                        <pic:spPr>
+                          <a:xfrm>
+                            <a:off x="0" y="0"/>
+                            <a:ext cx="2223751" cy="1091629"/>
+                          </a:xfrm>
+                          <a:prstGeom prst="rect">
+                            <a:avLst/>
+                          </a:prstGeom>
+                        </pic:spPr>
+                      </pic:pic>
+                    </a:graphicData>
+                  </a:graphic>
+                </wp:inline>
+              </w:drawing>
             </w:r>
           </w:p>
         </w:tc>
@@ -1829,6 +1901,18 @@
               </w:rPr>
               <w:t>Logging out brings the user back to the landing page.</w:t>
             </w:r>
+            <w:r>
+              <w:rPr>
+                <w:rFonts w:ascii="Arial" w:hAnsi="Arial" w:cs="Arial"/>
+                <w:color w:val="C00000"/>
+                <w:sz w:val="20"/>
+                <w:szCs w:val="20"/>
+              </w:rPr>
+              <w:t xml:space="preserve"> </w:t>
+            </w:r>
+            <w:r>
+              <w:t xml:space="preserve"> </w:t>
+            </w:r>
           </w:p>
         </w:tc>
         <w:tc>
@@ -1877,7 +1961,78 @@
                 <w:sz w:val="20"/>
                 <w:szCs w:val="20"/>
               </w:rPr>
-              <w:t>&lt;yes/no&gt;</w:t>
+              <w:t>ye</w:t>
+            </w:r>
+            <w:r>
+              <w:rPr>
+                <w:rFonts w:ascii="Arial" w:hAnsi="Arial" w:cs="Arial"/>
+                <w:color w:val="538135" w:themeColor="accent6" w:themeShade="BF"/>
+                <w:sz w:val="20"/>
+                <w:szCs w:val="20"/>
+              </w:rPr>
+              <w:t>s</w:t>
+            </w:r>
+          </w:p>
+          <w:p>
+            <w:pPr>
+              <w:spacing w:before="80" w:after="80"/>
+              <w:rPr>
+                <w:rFonts w:ascii="Arial" w:hAnsi="Arial" w:cs="Arial"/>
+                <w:color w:val="538135" w:themeColor="accent6" w:themeShade="BF"/>
+                <w:sz w:val="20"/>
+                <w:szCs w:val="20"/>
+              </w:rPr>
+            </w:pPr>
+            <w:r>
+              <w:rPr>
+                <w:rFonts w:ascii="Arial" w:hAnsi="Arial" w:cs="Arial"/>
+                <w:noProof/>
+                <w:color w:val="538135" w:themeColor="accent6" w:themeShade="BF"/>
+                <w:sz w:val="20"/>
+                <w:szCs w:val="20"/>
+              </w:rPr>
+              <w:lastRenderedPageBreak/>
+              <w:drawing>
+                <wp:inline distT="0" distB="0" distL="0" distR="0" wp14:anchorId="4C1471BF" wp14:editId="5BF3A45D">
+                  <wp:extent cx="2308633" cy="1204016"/>
+                  <wp:effectExtent l="0" t="0" r="3175" b="2540"/>
+                  <wp:docPr id="1814850967" name="Picture 3"/>
+                  <wp:cNvGraphicFramePr>
+                    <a:graphicFrameLocks xmlns:a="http://schemas.openxmlformats.org/drawingml/2006/main" noChangeAspect="1"/>
+                  </wp:cNvGraphicFramePr>
+                  <a:graphic xmlns:a="http://schemas.openxmlformats.org/drawingml/2006/main">
+                    <a:graphicData uri="http://schemas.openxmlformats.org/drawingml/2006/picture">
+                      <pic:pic xmlns:pic="http://schemas.openxmlformats.org/drawingml/2006/picture">
+                        <pic:nvPicPr>
+                          <pic:cNvPr id="1814850967" name="Picture 1814850967"/>
+                          <pic:cNvPicPr/>
+                        </pic:nvPicPr>
+                        <pic:blipFill>
+                          <a:blip r:embed="rId9" cstate="print">
+                            <a:extLst>
+                              <a:ext uri="{28A0092B-C50C-407E-A947-70E740481C1C}">
+                                <a14:useLocalDpi xmlns:a14="http://schemas.microsoft.com/office/drawing/2010/main" val="0"/>
+                              </a:ext>
+                            </a:extLst>
+                          </a:blip>
+                          <a:stretch>
+                            <a:fillRect/>
+                          </a:stretch>
+                        </pic:blipFill>
+                        <pic:spPr>
+                          <a:xfrm>
+                            <a:off x="0" y="0"/>
+                            <a:ext cx="2324605" cy="1212346"/>
+                          </a:xfrm>
+                          <a:prstGeom prst="rect">
+                            <a:avLst/>
+                          </a:prstGeom>
+                        </pic:spPr>
+                      </pic:pic>
+                    </a:graphicData>
+                  </a:graphic>
+                </wp:inline>
+              </w:drawing>
             </w:r>
           </w:p>
         </w:tc>
@@ -1905,6 +2060,7 @@
                 <w:sz w:val="20"/>
                 <w:szCs w:val="20"/>
               </w:rPr>
+              <w:lastRenderedPageBreak/>
               <w:t>4</w:t>
             </w:r>
           </w:p>
@@ -2005,7 +2161,77 @@
                 <w:sz w:val="20"/>
                 <w:szCs w:val="20"/>
               </w:rPr>
-              <w:t>&lt;yes/no&gt;</w:t>
+              <w:t>ye</w:t>
+            </w:r>
+            <w:r>
+              <w:rPr>
+                <w:rFonts w:ascii="Arial" w:hAnsi="Arial" w:cs="Arial"/>
+                <w:color w:val="538135" w:themeColor="accent6" w:themeShade="BF"/>
+                <w:sz w:val="20"/>
+                <w:szCs w:val="20"/>
+              </w:rPr>
+              <w:t>s</w:t>
+            </w:r>
+          </w:p>
+          <w:p>
+            <w:pPr>
+              <w:spacing w:before="80" w:after="80"/>
+              <w:rPr>
+                <w:rFonts w:ascii="Arial" w:hAnsi="Arial" w:cs="Arial"/>
+                <w:color w:val="538135" w:themeColor="accent6" w:themeShade="BF"/>
+                <w:sz w:val="20"/>
+                <w:szCs w:val="20"/>
+              </w:rPr>
+            </w:pPr>
+            <w:r>
+              <w:rPr>
+                <w:rFonts w:ascii="Arial" w:hAnsi="Arial" w:cs="Arial"/>
+                <w:noProof/>
+                <w:color w:val="538135" w:themeColor="accent6" w:themeShade="BF"/>
+                <w:sz w:val="20"/>
+                <w:szCs w:val="20"/>
+              </w:rPr>
+              <w:drawing>
+                <wp:inline distT="0" distB="0" distL="0" distR="0" wp14:anchorId="01C15A73" wp14:editId="429EAA2F">
+                  <wp:extent cx="2291860" cy="1204111"/>
+                  <wp:effectExtent l="0" t="0" r="0" b="2540"/>
+                  <wp:docPr id="1631039696" name="Picture 4"/>
+                  <wp:cNvGraphicFramePr>
+                    <a:graphicFrameLocks xmlns:a="http://schemas.openxmlformats.org/drawingml/2006/main" noChangeAspect="1"/>
+                  </wp:cNvGraphicFramePr>
+                  <a:graphic xmlns:a="http://schemas.openxmlformats.org/drawingml/2006/main">
+                    <a:graphicData uri="http://schemas.openxmlformats.org/drawingml/2006/picture">
+                      <pic:pic xmlns:pic="http://schemas.openxmlformats.org/drawingml/2006/picture">
+                        <pic:nvPicPr>
+                          <pic:cNvPr id="1631039696" name="Picture 1631039696"/>
+                          <pic:cNvPicPr/>
+                        </pic:nvPicPr>
+                        <pic:blipFill>
+                          <a:blip r:embed="rId10" cstate="print">
+                            <a:extLst>
+                              <a:ext uri="{28A0092B-C50C-407E-A947-70E740481C1C}">
+                                <a14:useLocalDpi xmlns:a14="http://schemas.microsoft.com/office/drawing/2010/main" val="0"/>
+                              </a:ext>
+                            </a:extLst>
+                          </a:blip>
+                          <a:stretch>
+                            <a:fillRect/>
+                          </a:stretch>
+                        </pic:blipFill>
+                        <pic:spPr>
+                          <a:xfrm>
+                            <a:off x="0" y="0"/>
+                            <a:ext cx="2324775" cy="1221404"/>
+                          </a:xfrm>
+                          <a:prstGeom prst="rect">
+                            <a:avLst/>
+                          </a:prstGeom>
+                        </pic:spPr>
+                      </pic:pic>
+                    </a:graphicData>
+                  </a:graphic>
+                </wp:inline>
+              </w:drawing>
             </w:r>
           </w:p>
         </w:tc>
@@ -2153,7 +2379,77 @@
                 <w:sz w:val="20"/>
                 <w:szCs w:val="20"/>
               </w:rPr>
-              <w:t>&lt;yes/no&gt;</w:t>
+              <w:t>ye</w:t>
+            </w:r>
+            <w:r>
+              <w:rPr>
+                <w:rFonts w:ascii="Arial" w:hAnsi="Arial" w:cs="Arial"/>
+                <w:color w:val="538135" w:themeColor="accent6" w:themeShade="BF"/>
+                <w:sz w:val="20"/>
+                <w:szCs w:val="20"/>
+              </w:rPr>
+              <w:t>s</w:t>
+            </w:r>
+          </w:p>
+          <w:p>
+            <w:pPr>
+              <w:spacing w:before="80" w:after="80"/>
+              <w:rPr>
+                <w:rFonts w:ascii="Arial" w:hAnsi="Arial" w:cs="Arial"/>
+                <w:color w:val="538135" w:themeColor="accent6" w:themeShade="BF"/>
+                <w:sz w:val="20"/>
+                <w:szCs w:val="20"/>
+              </w:rPr>
+            </w:pPr>
+            <w:r>
+              <w:rPr>
+                <w:rFonts w:ascii="Arial" w:hAnsi="Arial" w:cs="Arial"/>
+                <w:noProof/>
+                <w:color w:val="538135" w:themeColor="accent6" w:themeShade="BF"/>
+                <w:sz w:val="20"/>
+                <w:szCs w:val="20"/>
+              </w:rPr>
+              <w:drawing>
+                <wp:inline distT="0" distB="0" distL="0" distR="0" wp14:anchorId="0BF4AE15" wp14:editId="3209F23C">
+                  <wp:extent cx="2261161" cy="2390115"/>
+                  <wp:effectExtent l="0" t="0" r="0" b="0"/>
+                  <wp:docPr id="424611369" name="Picture 5"/>
+                  <wp:cNvGraphicFramePr>
+                    <a:graphicFrameLocks xmlns:a="http://schemas.openxmlformats.org/drawingml/2006/main" noChangeAspect="1"/>
+                  </wp:cNvGraphicFramePr>
+                  <a:graphic xmlns:a="http://schemas.openxmlformats.org/drawingml/2006/main">
+                    <a:graphicData uri="http://schemas.openxmlformats.org/drawingml/2006/picture">
+                      <pic:pic xmlns:pic="http://schemas.openxmlformats.org/drawingml/2006/picture">
+                        <pic:nvPicPr>
+                          <pic:cNvPr id="424611369" name="Picture 424611369"/>
+                          <pic:cNvPicPr/>
+                        </pic:nvPicPr>
+                        <pic:blipFill>
+                          <a:blip r:embed="rId11" cstate="print">
+                            <a:extLst>
+                              <a:ext uri="{28A0092B-C50C-407E-A947-70E740481C1C}">
+                                <a14:useLocalDpi xmlns:a14="http://schemas.microsoft.com/office/drawing/2010/main" val="0"/>
+                              </a:ext>
+                            </a:extLst>
+                          </a:blip>
+                          <a:stretch>
+                            <a:fillRect/>
+                          </a:stretch>
+                        </pic:blipFill>
+                        <pic:spPr>
+                          <a:xfrm>
+                            <a:off x="0" y="0"/>
+                            <a:ext cx="2264187" cy="2393314"/>
+                          </a:xfrm>
+                          <a:prstGeom prst="rect">
+                            <a:avLst/>
+                          </a:prstGeom>
+                        </pic:spPr>
+                      </pic:pic>
+                    </a:graphicData>
+                  </a:graphic>
+                </wp:inline>
+              </w:drawing>
             </w:r>
           </w:p>
         </w:tc>
@@ -2181,6 +2477,7 @@
                 <w:sz w:val="20"/>
                 <w:szCs w:val="20"/>
               </w:rPr>
+              <w:lastRenderedPageBreak/>
               <w:t>6</w:t>
             </w:r>
           </w:p>
@@ -2290,7 +2587,77 @@
                 <w:sz w:val="20"/>
                 <w:szCs w:val="20"/>
               </w:rPr>
-              <w:t>&lt;yes/no&gt;</w:t>
+              <w:t>ye</w:t>
+            </w:r>
+            <w:r>
+              <w:rPr>
+                <w:rFonts w:ascii="Arial" w:hAnsi="Arial" w:cs="Arial"/>
+                <w:color w:val="538135" w:themeColor="accent6" w:themeShade="BF"/>
+                <w:sz w:val="20"/>
+                <w:szCs w:val="20"/>
+              </w:rPr>
+              <w:t>s</w:t>
+            </w:r>
+          </w:p>
+          <w:p>
+            <w:pPr>
+              <w:spacing w:before="80" w:after="80"/>
+              <w:rPr>
+                <w:rFonts w:ascii="Arial" w:hAnsi="Arial" w:cs="Arial"/>
+                <w:color w:val="538135" w:themeColor="accent6" w:themeShade="BF"/>
+                <w:sz w:val="20"/>
+                <w:szCs w:val="20"/>
+              </w:rPr>
+            </w:pPr>
+            <w:r>
+              <w:rPr>
+                <w:rFonts w:ascii="Arial" w:hAnsi="Arial" w:cs="Arial"/>
+                <w:noProof/>
+                <w:color w:val="538135" w:themeColor="accent6" w:themeShade="BF"/>
+                <w:sz w:val="20"/>
+                <w:szCs w:val="20"/>
+              </w:rPr>
+              <w:drawing>
+                <wp:inline distT="0" distB="0" distL="0" distR="0" wp14:anchorId="04009EC7" wp14:editId="28A08B3A">
+                  <wp:extent cx="2261161" cy="2390115"/>
+                  <wp:effectExtent l="0" t="0" r="0" b="0"/>
+                  <wp:docPr id="491921157" name="Picture 5"/>
+                  <wp:cNvGraphicFramePr>
+                    <a:graphicFrameLocks xmlns:a="http://schemas.openxmlformats.org/drawingml/2006/main" noChangeAspect="1"/>
+                  </wp:cNvGraphicFramePr>
+                  <a:graphic xmlns:a="http://schemas.openxmlformats.org/drawingml/2006/main">
+                    <a:graphicData uri="http://schemas.openxmlformats.org/drawingml/2006/picture">
+                      <pic:pic xmlns:pic="http://schemas.openxmlformats.org/drawingml/2006/picture">
+                        <pic:nvPicPr>
+                          <pic:cNvPr id="424611369" name="Picture 424611369"/>
+                          <pic:cNvPicPr/>
+                        </pic:nvPicPr>
+                        <pic:blipFill>
+                          <a:blip r:embed="rId11" cstate="print">
+                            <a:extLst>
+                              <a:ext uri="{28A0092B-C50C-407E-A947-70E740481C1C}">
+                                <a14:useLocalDpi xmlns:a14="http://schemas.microsoft.com/office/drawing/2010/main" val="0"/>
+                              </a:ext>
+                            </a:extLst>
+                          </a:blip>
+                          <a:stretch>
+                            <a:fillRect/>
+                          </a:stretch>
+                        </pic:blipFill>
+                        <pic:spPr>
+                          <a:xfrm>
+                            <a:off x="0" y="0"/>
+                            <a:ext cx="2264187" cy="2393314"/>
+                          </a:xfrm>
+                          <a:prstGeom prst="rect">
+                            <a:avLst/>
+                          </a:prstGeom>
+                        </pic:spPr>
+                      </pic:pic>
+                    </a:graphicData>
+                  </a:graphic>
+                </wp:inline>
+              </w:drawing>
             </w:r>
           </w:p>
         </w:tc>
@@ -2472,7 +2839,77 @@
                 <w:sz w:val="20"/>
                 <w:szCs w:val="20"/>
               </w:rPr>
-              <w:t>&lt;yes/no&gt;</w:t>
+              <w:t>ye</w:t>
+            </w:r>
+            <w:r>
+              <w:rPr>
+                <w:rFonts w:ascii="Arial" w:hAnsi="Arial" w:cs="Arial"/>
+                <w:color w:val="538135" w:themeColor="accent6" w:themeShade="BF"/>
+                <w:sz w:val="20"/>
+                <w:szCs w:val="20"/>
+              </w:rPr>
+              <w:t>s</w:t>
+            </w:r>
+          </w:p>
+          <w:p>
+            <w:pPr>
+              <w:spacing w:before="80" w:after="80"/>
+              <w:rPr>
+                <w:rFonts w:ascii="Arial" w:hAnsi="Arial" w:cs="Arial"/>
+                <w:color w:val="538135" w:themeColor="accent6" w:themeShade="BF"/>
+                <w:sz w:val="20"/>
+                <w:szCs w:val="20"/>
+              </w:rPr>
+            </w:pPr>
+            <w:r>
+              <w:rPr>
+                <w:rFonts w:ascii="Arial" w:hAnsi="Arial" w:cs="Arial"/>
+                <w:noProof/>
+                <w:color w:val="538135" w:themeColor="accent6" w:themeShade="BF"/>
+                <w:sz w:val="20"/>
+                <w:szCs w:val="20"/>
+              </w:rPr>
+              <w:drawing>
+                <wp:inline distT="0" distB="0" distL="0" distR="0" wp14:anchorId="196017DE" wp14:editId="10946983">
+                  <wp:extent cx="2244497" cy="1325396"/>
+                  <wp:effectExtent l="0" t="0" r="3810" b="0"/>
+                  <wp:docPr id="1168253954" name="Picture 6"/>
+                  <wp:cNvGraphicFramePr>
+                    <a:graphicFrameLocks xmlns:a="http://schemas.openxmlformats.org/drawingml/2006/main" noChangeAspect="1"/>
+                  </wp:cNvGraphicFramePr>
+                  <a:graphic xmlns:a="http://schemas.openxmlformats.org/drawingml/2006/main">
+                    <a:graphicData uri="http://schemas.openxmlformats.org/drawingml/2006/picture">
+                      <pic:pic xmlns:pic="http://schemas.openxmlformats.org/drawingml/2006/picture">
+                        <pic:nvPicPr>
+                          <pic:cNvPr id="1168253954" name="Picture 1168253954"/>
+                          <pic:cNvPicPr/>
+                        </pic:nvPicPr>
+                        <pic:blipFill>
+                          <a:blip r:embed="rId12" cstate="print">
+                            <a:extLst>
+                              <a:ext uri="{28A0092B-C50C-407E-A947-70E740481C1C}">
+                                <a14:useLocalDpi xmlns:a14="http://schemas.microsoft.com/office/drawing/2010/main" val="0"/>
+                              </a:ext>
+                            </a:extLst>
+                          </a:blip>
+                          <a:stretch>
+                            <a:fillRect/>
+                          </a:stretch>
+                        </pic:blipFill>
+                        <pic:spPr>
+                          <a:xfrm>
+                            <a:off x="0" y="0"/>
+                            <a:ext cx="2250819" cy="1329129"/>
+                          </a:xfrm>
+                          <a:prstGeom prst="rect">
+                            <a:avLst/>
+                          </a:prstGeom>
+                        </pic:spPr>
+                      </pic:pic>
+                    </a:graphicData>
+                  </a:graphic>
+                </wp:inline>
+              </w:drawing>
             </w:r>
           </w:p>
         </w:tc>
@@ -2504,7 +2941,6 @@
                 <w:sz w:val="20"/>
                 <w:szCs w:val="20"/>
               </w:rPr>
-              <w:lastRenderedPageBreak/>
               <w:t>Comments</w:t>
             </w:r>
           </w:p>
@@ -2531,7 +2967,7 @@
                 <w:sz w:val="20"/>
                 <w:szCs w:val="20"/>
               </w:rPr>
-              <w:t xml:space="preserve">Comments should be substantive; this means there should be at least 2-3 well-structured sentences with constructive feedback. </w:t>
+              <w:t xml:space="preserve">The function to log in and do make a reservation work as expected with no issues. Once the user enters the Look-Up Reservation page all aspects load as expected with no errors. Email look up works as expected and page can bring up all reservations associated with email. Including older test reservations and the one that was just made. Changing the look-up email to unknown one returns an error because there is no reservation associated. Prompts user to retry. </w:t>
             </w:r>
           </w:p>
         </w:tc>
@@ -2586,10 +3022,10 @@
       </w:tblPr>
       <w:tblGrid>
         <w:gridCol w:w="1250"/>
-        <w:gridCol w:w="3570"/>
-        <w:gridCol w:w="3930"/>
-        <w:gridCol w:w="2148"/>
-        <w:gridCol w:w="2052"/>
+        <w:gridCol w:w="2908"/>
+        <w:gridCol w:w="3114"/>
+        <w:gridCol w:w="1853"/>
+        <w:gridCol w:w="3825"/>
       </w:tblGrid>
       <w:tr>
         <w:trPr>
@@ -2615,6 +3051,7 @@
                 <w:sz w:val="24"/>
                 <w:szCs w:val="24"/>
               </w:rPr>
+              <w:lastRenderedPageBreak/>
               <w:t>Test 2</w:t>
             </w:r>
           </w:p>
@@ -2633,6 +3070,7 @@
                 <w:bCs/>
               </w:rPr>
             </w:pPr>
+            <w:bookmarkStart w:id="1" w:name="_Toc240801313"/>
             <w:r>
               <w:rPr>
                 <w:rFonts w:ascii="Arial" w:hAnsi="Arial" w:cs="Arial"/>
@@ -2641,6 +3079,7 @@
               </w:rPr>
               <w:t>Entering an MBR Number Displays an Associated Reservation</w:t>
             </w:r>
+            <w:bookmarkEnd w:id="1"/>
           </w:p>
         </w:tc>
       </w:tr>
@@ -2853,6 +3292,7 @@
                 <w:rFonts w:ascii="Arial" w:hAnsi="Arial" w:cs="Arial"/>
                 <w:b/>
                 <w:bCs/>
+                <w:color w:val="538135" w:themeColor="accent6" w:themeShade="BF"/>
                 <w:sz w:val="20"/>
                 <w:szCs w:val="20"/>
               </w:rPr>
@@ -2867,6 +3307,17 @@
               </w:rPr>
               <w:t xml:space="preserve">Peer tester: </w:t>
             </w:r>
+            <w:r>
+              <w:rPr>
+                <w:rFonts w:ascii="Arial" w:hAnsi="Arial" w:cs="Arial"/>
+                <w:b/>
+                <w:bCs/>
+                <w:color w:val="538135" w:themeColor="accent6" w:themeShade="BF"/>
+                <w:sz w:val="20"/>
+                <w:szCs w:val="20"/>
+              </w:rPr>
+              <w:t>Jose</w:t>
+            </w:r>
           </w:p>
           <w:p>
             <w:pPr>
@@ -2901,27 +3352,7 @@
                 <w:sz w:val="20"/>
                 <w:szCs w:val="20"/>
               </w:rPr>
-              <w:t>&lt;</w:t>
-            </w:r>
-            <w:proofErr w:type="spellStart"/>
-            <w:r>
-              <w:rPr>
-                <w:rFonts w:ascii="Arial" w:hAnsi="Arial" w:cs="Arial"/>
-                <w:color w:val="538135" w:themeColor="accent6" w:themeShade="BF"/>
-                <w:sz w:val="20"/>
-                <w:szCs w:val="20"/>
-              </w:rPr>
-              <w:t>yyyy</w:t>
-            </w:r>
-            <w:proofErr w:type="spellEnd"/>
-            <w:r>
-              <w:rPr>
-                <w:rFonts w:ascii="Arial" w:hAnsi="Arial" w:cs="Arial"/>
-                <w:color w:val="538135" w:themeColor="accent6" w:themeShade="BF"/>
-                <w:sz w:val="20"/>
-                <w:szCs w:val="20"/>
-              </w:rPr>
-              <w:t>/mm/dd&gt;</w:t>
+              <w:t>2026/09/20</w:t>
             </w:r>
           </w:p>
         </w:tc>
@@ -3177,19 +3608,89 @@
               <w:spacing w:before="80" w:after="80"/>
               <w:rPr>
                 <w:rFonts w:ascii="Arial" w:hAnsi="Arial" w:cs="Arial"/>
-                <w:color w:val="C00000"/>
-                <w:sz w:val="20"/>
-                <w:szCs w:val="20"/>
-              </w:rPr>
-            </w:pPr>
-            <w:r>
-              <w:rPr>
-                <w:rFonts w:ascii="Arial" w:hAnsi="Arial" w:cs="Arial"/>
                 <w:color w:val="538135" w:themeColor="accent6" w:themeShade="BF"/>
                 <w:sz w:val="20"/>
                 <w:szCs w:val="20"/>
               </w:rPr>
-              <w:t>&lt;yes/no&gt;</w:t>
+            </w:pPr>
+            <w:r>
+              <w:rPr>
+                <w:rFonts w:ascii="Arial" w:hAnsi="Arial" w:cs="Arial"/>
+                <w:color w:val="538135" w:themeColor="accent6" w:themeShade="BF"/>
+                <w:sz w:val="20"/>
+                <w:szCs w:val="20"/>
+              </w:rPr>
+              <w:t>ye</w:t>
+            </w:r>
+            <w:r>
+              <w:rPr>
+                <w:rFonts w:ascii="Arial" w:hAnsi="Arial" w:cs="Arial"/>
+                <w:color w:val="538135" w:themeColor="accent6" w:themeShade="BF"/>
+                <w:sz w:val="20"/>
+                <w:szCs w:val="20"/>
+              </w:rPr>
+              <w:t>s</w:t>
+            </w:r>
+          </w:p>
+          <w:p>
+            <w:pPr>
+              <w:spacing w:before="80" w:after="80"/>
+              <w:rPr>
+                <w:rFonts w:ascii="Arial" w:hAnsi="Arial" w:cs="Arial"/>
+                <w:color w:val="C00000"/>
+                <w:sz w:val="20"/>
+                <w:szCs w:val="20"/>
+              </w:rPr>
+            </w:pPr>
+            <w:r>
+              <w:rPr>
+                <w:rFonts w:ascii="Arial" w:hAnsi="Arial" w:cs="Arial"/>
+                <w:noProof/>
+                <w:color w:val="538135" w:themeColor="accent6" w:themeShade="BF"/>
+                <w:sz w:val="20"/>
+                <w:szCs w:val="20"/>
+              </w:rPr>
+              <w:drawing>
+                <wp:inline distT="0" distB="0" distL="0" distR="0" wp14:anchorId="54DEA2FC" wp14:editId="256E392E">
+                  <wp:extent cx="2291860" cy="1204111"/>
+                  <wp:effectExtent l="0" t="0" r="0" b="2540"/>
+                  <wp:docPr id="511003255" name="Picture 4"/>
+                  <wp:cNvGraphicFramePr>
+                    <a:graphicFrameLocks xmlns:a="http://schemas.openxmlformats.org/drawingml/2006/main" noChangeAspect="1"/>
+                  </wp:cNvGraphicFramePr>
+                  <a:graphic xmlns:a="http://schemas.openxmlformats.org/drawingml/2006/main">
+                    <a:graphicData uri="http://schemas.openxmlformats.org/drawingml/2006/picture">
+                      <pic:pic xmlns:pic="http://schemas.openxmlformats.org/drawingml/2006/picture">
+                        <pic:nvPicPr>
+                          <pic:cNvPr id="1631039696" name="Picture 1631039696"/>
+                          <pic:cNvPicPr/>
+                        </pic:nvPicPr>
+                        <pic:blipFill>
+                          <a:blip r:embed="rId10" cstate="print">
+                            <a:extLst>
+                              <a:ext uri="{28A0092B-C50C-407E-A947-70E740481C1C}">
+                                <a14:useLocalDpi xmlns:a14="http://schemas.microsoft.com/office/drawing/2010/main" val="0"/>
+                              </a:ext>
+                            </a:extLst>
+                          </a:blip>
+                          <a:stretch>
+                            <a:fillRect/>
+                          </a:stretch>
+                        </pic:blipFill>
+                        <pic:spPr>
+                          <a:xfrm>
+                            <a:off x="0" y="0"/>
+                            <a:ext cx="2324775" cy="1221404"/>
+                          </a:xfrm>
+                          <a:prstGeom prst="rect">
+                            <a:avLst/>
+                          </a:prstGeom>
+                        </pic:spPr>
+                      </pic:pic>
+                    </a:graphicData>
+                  </a:graphic>
+                </wp:inline>
+              </w:drawing>
             </w:r>
           </w:p>
         </w:tc>
@@ -3305,19 +3806,89 @@
               <w:spacing w:before="80" w:after="80"/>
               <w:rPr>
                 <w:rFonts w:ascii="Arial" w:hAnsi="Arial" w:cs="Arial"/>
-                <w:color w:val="C00000"/>
-                <w:sz w:val="20"/>
-                <w:szCs w:val="20"/>
-              </w:rPr>
-            </w:pPr>
-            <w:r>
-              <w:rPr>
-                <w:rFonts w:ascii="Arial" w:hAnsi="Arial" w:cs="Arial"/>
                 <w:color w:val="538135" w:themeColor="accent6" w:themeShade="BF"/>
                 <w:sz w:val="20"/>
                 <w:szCs w:val="20"/>
               </w:rPr>
-              <w:t>&lt;yes/no&gt;</w:t>
+            </w:pPr>
+            <w:r>
+              <w:rPr>
+                <w:rFonts w:ascii="Arial" w:hAnsi="Arial" w:cs="Arial"/>
+                <w:color w:val="538135" w:themeColor="accent6" w:themeShade="BF"/>
+                <w:sz w:val="20"/>
+                <w:szCs w:val="20"/>
+              </w:rPr>
+              <w:t>ye</w:t>
+            </w:r>
+            <w:r>
+              <w:rPr>
+                <w:rFonts w:ascii="Arial" w:hAnsi="Arial" w:cs="Arial"/>
+                <w:color w:val="538135" w:themeColor="accent6" w:themeShade="BF"/>
+                <w:sz w:val="20"/>
+                <w:szCs w:val="20"/>
+              </w:rPr>
+              <w:t>s</w:t>
+            </w:r>
+          </w:p>
+          <w:p>
+            <w:pPr>
+              <w:spacing w:before="80" w:after="80"/>
+              <w:rPr>
+                <w:rFonts w:ascii="Arial" w:hAnsi="Arial" w:cs="Arial"/>
+                <w:color w:val="C00000"/>
+                <w:sz w:val="20"/>
+                <w:szCs w:val="20"/>
+              </w:rPr>
+            </w:pPr>
+            <w:r>
+              <w:rPr>
+                <w:rFonts w:ascii="Arial" w:hAnsi="Arial" w:cs="Arial"/>
+                <w:noProof/>
+                <w:color w:val="C00000"/>
+                <w:sz w:val="20"/>
+                <w:szCs w:val="20"/>
+              </w:rPr>
+              <w:drawing>
+                <wp:inline distT="0" distB="0" distL="0" distR="0" wp14:anchorId="111FDA6D" wp14:editId="6CB2E0FD">
+                  <wp:extent cx="2199993" cy="1271277"/>
+                  <wp:effectExtent l="0" t="0" r="0" b="0"/>
+                  <wp:docPr id="324496833" name="Picture 7"/>
+                  <wp:cNvGraphicFramePr>
+                    <a:graphicFrameLocks xmlns:a="http://schemas.openxmlformats.org/drawingml/2006/main" noChangeAspect="1"/>
+                  </wp:cNvGraphicFramePr>
+                  <a:graphic xmlns:a="http://schemas.openxmlformats.org/drawingml/2006/main">
+                    <a:graphicData uri="http://schemas.openxmlformats.org/drawingml/2006/picture">
+                      <pic:pic xmlns:pic="http://schemas.openxmlformats.org/drawingml/2006/picture">
+                        <pic:nvPicPr>
+                          <pic:cNvPr id="324496833" name="Picture 324496833"/>
+                          <pic:cNvPicPr/>
+                        </pic:nvPicPr>
+                        <pic:blipFill>
+                          <a:blip r:embed="rId13" cstate="print">
+                            <a:extLst>
+                              <a:ext uri="{28A0092B-C50C-407E-A947-70E740481C1C}">
+                                <a14:useLocalDpi xmlns:a14="http://schemas.microsoft.com/office/drawing/2010/main" val="0"/>
+                              </a:ext>
+                            </a:extLst>
+                          </a:blip>
+                          <a:stretch>
+                            <a:fillRect/>
+                          </a:stretch>
+                        </pic:blipFill>
+                        <pic:spPr>
+                          <a:xfrm>
+                            <a:off x="0" y="0"/>
+                            <a:ext cx="2237775" cy="1293110"/>
+                          </a:xfrm>
+                          <a:prstGeom prst="rect">
+                            <a:avLst/>
+                          </a:prstGeom>
+                        </pic:spPr>
+                      </pic:pic>
+                    </a:graphicData>
+                  </a:graphic>
+                </wp:inline>
+              </w:drawing>
             </w:r>
           </w:p>
         </w:tc>
@@ -3345,6 +3916,7 @@
                 <w:sz w:val="20"/>
                 <w:szCs w:val="20"/>
               </w:rPr>
+              <w:lastRenderedPageBreak/>
               <w:t>3</w:t>
             </w:r>
           </w:p>
@@ -3469,19 +4041,89 @@
               <w:spacing w:before="80" w:after="80"/>
               <w:rPr>
                 <w:rFonts w:ascii="Arial" w:hAnsi="Arial" w:cs="Arial"/>
-                <w:color w:val="C00000"/>
-                <w:sz w:val="20"/>
-                <w:szCs w:val="20"/>
-              </w:rPr>
-            </w:pPr>
-            <w:r>
-              <w:rPr>
-                <w:rFonts w:ascii="Arial" w:hAnsi="Arial" w:cs="Arial"/>
                 <w:color w:val="538135" w:themeColor="accent6" w:themeShade="BF"/>
                 <w:sz w:val="20"/>
                 <w:szCs w:val="20"/>
               </w:rPr>
-              <w:t>&lt;yes/no&gt;</w:t>
+            </w:pPr>
+            <w:r>
+              <w:rPr>
+                <w:rFonts w:ascii="Arial" w:hAnsi="Arial" w:cs="Arial"/>
+                <w:color w:val="538135" w:themeColor="accent6" w:themeShade="BF"/>
+                <w:sz w:val="20"/>
+                <w:szCs w:val="20"/>
+              </w:rPr>
+              <w:t>ye</w:t>
+            </w:r>
+            <w:r>
+              <w:rPr>
+                <w:rFonts w:ascii="Arial" w:hAnsi="Arial" w:cs="Arial"/>
+                <w:color w:val="538135" w:themeColor="accent6" w:themeShade="BF"/>
+                <w:sz w:val="20"/>
+                <w:szCs w:val="20"/>
+              </w:rPr>
+              <w:t>s</w:t>
+            </w:r>
+          </w:p>
+          <w:p>
+            <w:pPr>
+              <w:spacing w:before="80" w:after="80"/>
+              <w:rPr>
+                <w:rFonts w:ascii="Arial" w:hAnsi="Arial" w:cs="Arial"/>
+                <w:color w:val="C00000"/>
+                <w:sz w:val="20"/>
+                <w:szCs w:val="20"/>
+              </w:rPr>
+            </w:pPr>
+            <w:r>
+              <w:rPr>
+                <w:rFonts w:ascii="Arial" w:hAnsi="Arial" w:cs="Arial"/>
+                <w:noProof/>
+                <w:color w:val="C00000"/>
+                <w:sz w:val="20"/>
+                <w:szCs w:val="20"/>
+              </w:rPr>
+              <w:drawing>
+                <wp:inline distT="0" distB="0" distL="0" distR="0" wp14:anchorId="6432280D" wp14:editId="2113642D">
+                  <wp:extent cx="2199992" cy="1288761"/>
+                  <wp:effectExtent l="0" t="0" r="0" b="0"/>
+                  <wp:docPr id="115976743" name="Picture 8"/>
+                  <wp:cNvGraphicFramePr>
+                    <a:graphicFrameLocks xmlns:a="http://schemas.openxmlformats.org/drawingml/2006/main" noChangeAspect="1"/>
+                  </wp:cNvGraphicFramePr>
+                  <a:graphic xmlns:a="http://schemas.openxmlformats.org/drawingml/2006/main">
+                    <a:graphicData uri="http://schemas.openxmlformats.org/drawingml/2006/picture">
+                      <pic:pic xmlns:pic="http://schemas.openxmlformats.org/drawingml/2006/picture">
+                        <pic:nvPicPr>
+                          <pic:cNvPr id="115976743" name="Picture 115976743"/>
+                          <pic:cNvPicPr/>
+                        </pic:nvPicPr>
+                        <pic:blipFill>
+                          <a:blip r:embed="rId14" cstate="print">
+                            <a:extLst>
+                              <a:ext uri="{28A0092B-C50C-407E-A947-70E740481C1C}">
+                                <a14:useLocalDpi xmlns:a14="http://schemas.microsoft.com/office/drawing/2010/main" val="0"/>
+                              </a:ext>
+                            </a:extLst>
+                          </a:blip>
+                          <a:stretch>
+                            <a:fillRect/>
+                          </a:stretch>
+                        </pic:blipFill>
+                        <pic:spPr>
+                          <a:xfrm>
+                            <a:off x="0" y="0"/>
+                            <a:ext cx="2232756" cy="1307954"/>
+                          </a:xfrm>
+                          <a:prstGeom prst="rect">
+                            <a:avLst/>
+                          </a:prstGeom>
+                        </pic:spPr>
+                      </pic:pic>
+                    </a:graphicData>
+                  </a:graphic>
+                </wp:inline>
+              </w:drawing>
             </w:r>
           </w:p>
         </w:tc>
@@ -3539,7 +4181,7 @@
                 <w:sz w:val="20"/>
                 <w:szCs w:val="20"/>
               </w:rPr>
-              <w:t>Comments should be substantive; this means there should be at least 2-3 well-structured sentences with constructive feedback.</w:t>
+              <w:t xml:space="preserve">Page loads with no visible errors. User can enter MR number of reservation that was created in test plan 1 and page is able to return reservation. All info from the reservation come up as expected and match what was entered when it was made. Entering an unknown MBR number returns an error with a message that prompts user to try again. </w:t>
             </w:r>
           </w:p>
         </w:tc>
@@ -3616,8 +4258,8 @@
       </w:pPr>
     </w:p>
     <w:sectPr>
-      <w:headerReference w:type="default" r:id="rId7"/>
-      <w:footerReference w:type="default" r:id="rId8"/>
+      <w:headerReference w:type="default" r:id="rId15"/>
+      <w:footerReference w:type="default" r:id="rId16"/>
       <w:pgSz w:w="15840" w:h="12240" w:orient="landscape"/>
       <w:pgMar w:top="1440" w:right="1440" w:bottom="1440" w:left="1440" w:header="720" w:footer="720" w:gutter="0"/>
       <w:cols w:space="720"/>

</xml_diff>